<commit_message>
commit depois de muito tempo
</commit_message>
<xml_diff>
--- a/Redes/Template_GS_1(4).docx
+++ b/Redes/Template_GS_1(4).docx
@@ -472,67 +472,42 @@
         </w:pBdr>
         <w:shd w:val="clear" w:color="auto" w:fill="FFFF00"/>
         <w:rPr>
-          <w:rFonts w:hint="default" w:ascii="Arial" w:hAnsi="Arial" w:eastAsia="Times New Roman" w:cs="Times New Roman"/>
+          <w:rFonts w:ascii="Arial" w:hAnsi="Arial" w:eastAsia="Times New Roman" w:cs="Times New Roman"/>
+          <w:b/>
+          <w:bCs/>
+          <w:color w:val="C00000"/>
+        </w:rPr>
+      </w:pPr>
+      <w:r>
+        <w:rPr>
+          <w:rFonts w:ascii="Arial" w:hAnsi="Arial" w:eastAsia="Times New Roman" w:cs="Times New Roman"/>
+          <w:b/>
+          <w:bCs/>
+          <w:color w:val="C00000"/>
+        </w:rPr>
+        <w:t>*</w:t>
+      </w:r>
+      <w:r>
+        <w:rPr>
+          <w:rFonts w:hint="default" w:ascii="Arial" w:hAnsi="Arial" w:eastAsia="Times New Roman"/>
+          <w:b/>
+          <w:bCs/>
+          <w:color w:val="C00000"/>
+        </w:rPr>
+        <w:t>Gean Lucas Teco Pfefer</w:t>
+      </w:r>
+      <w:r>
+        <w:rPr>
+          <w:rFonts w:hint="default" w:ascii="Arial" w:hAnsi="Arial" w:eastAsia="Times New Roman"/>
           <w:b/>
           <w:bCs/>
           <w:color w:val="C00000"/>
           <w:lang w:val="pt-BR"/>
         </w:rPr>
-      </w:pPr>
-      <w:r>
-        <w:rPr>
-          <w:rFonts w:ascii="Arial" w:hAnsi="Arial" w:eastAsia="Times New Roman" w:cs="Times New Roman"/>
-          <w:b/>
-          <w:bCs/>
-          <w:color w:val="C00000"/>
-        </w:rPr>
-        <w:t>*</w:t>
-      </w:r>
-      <w:r>
-        <w:rPr>
-          <w:rFonts w:hint="default" w:ascii="Arial" w:hAnsi="Arial" w:eastAsia="Times New Roman"/>
-          <w:b/>
-          <w:bCs/>
-          <w:color w:val="C00000"/>
-        </w:rPr>
-        <w:t>Gean Lucas Teco Pfefer</w:t>
-      </w:r>
-      <w:r>
-        <w:rPr>
-          <w:rFonts w:hint="default" w:ascii="Arial" w:hAnsi="Arial" w:eastAsia="Times New Roman"/>
-          <w:b/>
-          <w:bCs/>
-          <w:color w:val="C00000"/>
-          <w:lang w:val="pt-BR"/>
-        </w:rPr>
         <w:t xml:space="preserve"> - RM88138</w:t>
       </w:r>
-    </w:p>
-    <w:p>
-      <w:pPr>
-        <w:pBdr>
-          <w:top w:val="single" w:color="auto" w:sz="4" w:space="1"/>
-          <w:left w:val="single" w:color="auto" w:sz="4" w:space="4"/>
-          <w:bottom w:val="single" w:color="auto" w:sz="4" w:space="1"/>
-          <w:right w:val="single" w:color="auto" w:sz="4" w:space="4"/>
-        </w:pBdr>
-        <w:shd w:val="clear" w:color="auto" w:fill="FFFF00"/>
-        <w:rPr>
-          <w:rFonts w:ascii="Arial" w:hAnsi="Arial" w:eastAsia="Times New Roman" w:cs="Times New Roman"/>
-          <w:b/>
-          <w:bCs/>
-          <w:color w:val="C00000"/>
-        </w:rPr>
-      </w:pPr>
-      <w:r>
-        <w:rPr>
-          <w:rFonts w:ascii="Arial" w:hAnsi="Arial" w:eastAsia="Times New Roman" w:cs="Times New Roman"/>
-          <w:b/>
-          <w:bCs/>
-          <w:color w:val="C00000"/>
-        </w:rPr>
-        <w:t>*</w:t>
-      </w:r>
+      <w:bookmarkStart w:id="0" w:name="_GoBack"/>
+      <w:bookmarkEnd w:id="0"/>
     </w:p>
     <w:p>
       <w:pPr>
@@ -11987,8 +11962,6 @@
         </w:rPr>
         <w:br w:type="page"/>
       </w:r>
-      <w:bookmarkStart w:id="0" w:name="_GoBack"/>
-      <w:bookmarkEnd w:id="0"/>
     </w:p>
     <w:p>
       <w:pPr>

</xml_diff>

<commit_message>
conclusão da materia de SO
</commit_message>
<xml_diff>
--- a/Redes/Template_GS_1(4).docx
+++ b/Redes/Template_GS_1(4).docx
@@ -506,8 +506,6 @@
         </w:rPr>
         <w:t xml:space="preserve"> - RM88138</w:t>
       </w:r>
-      <w:bookmarkStart w:id="0" w:name="_GoBack"/>
-      <w:bookmarkEnd w:id="0"/>
     </w:p>
     <w:p>
       <w:pPr>
@@ -11655,10 +11653,11 @@
     <w:p>
       <w:pPr>
         <w:rPr>
-          <w:rFonts w:ascii="Arial" w:hAnsi="Arial" w:eastAsia="Times New Roman" w:cs="Arial"/>
-          <w:bCs/>
-          <w:sz w:val="20"/>
-          <w:szCs w:val="20"/>
+          <w:rFonts w:hint="default" w:ascii="Arial" w:hAnsi="Arial" w:eastAsia="Times New Roman" w:cs="Arial"/>
+          <w:bCs/>
+          <w:sz w:val="20"/>
+          <w:szCs w:val="20"/>
+          <w:lang w:val="pt-BR"/>
         </w:rPr>
       </w:pPr>
       <w:r>
@@ -11672,24 +11671,16 @@
       </w:r>
       <w:r>
         <w:rPr>
-          <w:rFonts w:ascii="Arial" w:hAnsi="Arial" w:eastAsia="Times New Roman" w:cs="Arial"/>
-          <w:bCs/>
-          <w:sz w:val="20"/>
-          <w:szCs w:val="20"/>
-        </w:rPr>
-        <w:t xml:space="preserve"> Preencha o espaço a seguir com uma proposta de regra de uma política de segurança a ser implementada na topologia.</w:t>
-      </w:r>
-    </w:p>
-    <w:p>
-      <w:pPr>
-        <w:rPr>
           <w:rFonts w:hint="default" w:ascii="Arial" w:hAnsi="Arial" w:eastAsia="Times New Roman" w:cs="Arial"/>
-          <w:bCs/>
+          <w:b/>
           <w:sz w:val="20"/>
           <w:szCs w:val="20"/>
           <w:lang w:val="pt-BR"/>
         </w:rPr>
-      </w:pPr>
+        <w:t xml:space="preserve"> </w:t>
+      </w:r>
+      <w:bookmarkStart w:id="0" w:name="_GoBack"/>
+      <w:bookmarkEnd w:id="0"/>
       <w:r>
         <w:rPr>
           <w:rFonts w:hint="default" w:ascii="Arial" w:hAnsi="Arial" w:eastAsia="Times New Roman" w:cs="Arial"/>
@@ -11839,10 +11830,11 @@
     <w:p>
       <w:pPr>
         <w:rPr>
-          <w:rFonts w:ascii="Arial" w:hAnsi="Arial" w:eastAsia="Times New Roman" w:cs="Arial"/>
-          <w:bCs/>
-          <w:sz w:val="20"/>
-          <w:szCs w:val="20"/>
+          <w:rFonts w:hint="default" w:ascii="Arial" w:hAnsi="Arial" w:eastAsia="Times New Roman" w:cs="Arial"/>
+          <w:bCs/>
+          <w:sz w:val="20"/>
+          <w:szCs w:val="20"/>
+          <w:lang w:val="pt-BR"/>
         </w:rPr>
       </w:pPr>
       <w:r>
@@ -11861,19 +11853,8 @@
           <w:sz w:val="20"/>
           <w:szCs w:val="20"/>
         </w:rPr>
-        <w:t xml:space="preserve"> Preencha o espaço a seguir com uma proposta de regra de uma política de segurança a ser implementada na topologia.</w:t>
-      </w:r>
-    </w:p>
-    <w:p>
-      <w:pPr>
-        <w:rPr>
-          <w:rFonts w:hint="default" w:ascii="Arial" w:hAnsi="Arial" w:eastAsia="Times New Roman" w:cs="Arial"/>
-          <w:bCs/>
-          <w:sz w:val="20"/>
-          <w:szCs w:val="20"/>
-          <w:lang w:val="pt-BR"/>
-        </w:rPr>
-      </w:pPr>
+        <w:t xml:space="preserve"> </w:t>
+      </w:r>
       <w:r>
         <w:rPr>
           <w:rFonts w:hint="default" w:ascii="Arial" w:hAnsi="Arial" w:eastAsia="Times New Roman" w:cs="Arial"/>
@@ -14151,6 +14132,7 @@
     <w:basedOn w:val="11"/>
     <w:link w:val="6"/>
     <w:semiHidden/>
+    <w:qFormat/>
     <w:uiPriority w:val="9"/>
     <w:rPr>
       <w:rFonts w:asciiTheme="majorHAnsi" w:hAnsiTheme="majorHAnsi" w:eastAsiaTheme="majorEastAsia" w:cstheme="majorBidi"/>

</xml_diff>

<commit_message>
atualização no projeto de redes
</commit_message>
<xml_diff>
--- a/Redes/Template_GS_1(4).docx
+++ b/Redes/Template_GS_1(4).docx
@@ -435,31 +435,49 @@
         </w:pBdr>
         <w:shd w:val="clear" w:color="auto" w:fill="FFFF00"/>
         <w:rPr>
+          <w:rFonts w:ascii="Arial" w:hAnsi="Arial" w:eastAsia="Times New Roman" w:cs="Times New Roman"/>
+          <w:b/>
+          <w:bCs/>
+          <w:color w:val="C00000"/>
+        </w:rPr>
+      </w:pPr>
+      <w:r>
+        <w:rPr>
+          <w:rFonts w:ascii="Arial" w:hAnsi="Arial" w:eastAsia="Times New Roman" w:cs="Times New Roman"/>
+          <w:b/>
+          <w:bCs/>
+          <w:color w:val="C00000"/>
+        </w:rPr>
+        <w:t>*</w:t>
+      </w:r>
+      <w:r>
+        <w:rPr>
           <w:rFonts w:hint="default" w:ascii="Arial" w:hAnsi="Arial" w:eastAsia="Times New Roman" w:cs="Times New Roman"/>
           <w:b/>
           <w:bCs/>
           <w:color w:val="C00000"/>
           <w:lang w:val="pt-BR"/>
         </w:rPr>
-      </w:pPr>
-      <w:r>
-        <w:rPr>
-          <w:rFonts w:ascii="Arial" w:hAnsi="Arial" w:eastAsia="Times New Roman" w:cs="Times New Roman"/>
+        <w:t xml:space="preserve"> </w:t>
+      </w:r>
+      <w:r>
+        <w:rPr>
+          <w:rFonts w:hint="default" w:ascii="Arial" w:hAnsi="Arial" w:eastAsia="Times New Roman"/>
           <w:b/>
           <w:bCs/>
           <w:color w:val="C00000"/>
         </w:rPr>
-        <w:t>*</w:t>
-      </w:r>
-      <w:r>
-        <w:rPr>
-          <w:rFonts w:hint="default" w:ascii="Arial" w:hAnsi="Arial" w:eastAsia="Times New Roman" w:cs="Times New Roman"/>
+        <w:t>Gean Lucas Teco Pfefer</w:t>
+      </w:r>
+      <w:r>
+        <w:rPr>
+          <w:rFonts w:hint="default" w:ascii="Arial" w:hAnsi="Arial" w:eastAsia="Times New Roman"/>
           <w:b/>
           <w:bCs/>
           <w:color w:val="C00000"/>
           <w:lang w:val="pt-BR"/>
         </w:rPr>
-        <w:t xml:space="preserve"> Matheus Cavalcanti Rebola - RM81030</w:t>
+        <w:t xml:space="preserve"> - RM88138</w:t>
       </w:r>
     </w:p>
     <w:p>
@@ -472,39 +490,31 @@
         </w:pBdr>
         <w:shd w:val="clear" w:color="auto" w:fill="FFFF00"/>
         <w:rPr>
+          <w:rFonts w:hint="default" w:ascii="Arial" w:hAnsi="Arial" w:eastAsia="Times New Roman" w:cs="Times New Roman"/>
+          <w:b/>
+          <w:bCs/>
+          <w:color w:val="C00000"/>
+          <w:lang w:val="pt-BR"/>
+        </w:rPr>
+      </w:pPr>
+      <w:r>
+        <w:rPr>
           <w:rFonts w:ascii="Arial" w:hAnsi="Arial" w:eastAsia="Times New Roman" w:cs="Times New Roman"/>
           <w:b/>
           <w:bCs/>
           <w:color w:val="C00000"/>
         </w:rPr>
-      </w:pPr>
-      <w:r>
-        <w:rPr>
-          <w:rFonts w:ascii="Arial" w:hAnsi="Arial" w:eastAsia="Times New Roman" w:cs="Times New Roman"/>
-          <w:b/>
-          <w:bCs/>
-          <w:color w:val="C00000"/>
-        </w:rPr>
         <w:t>*</w:t>
       </w:r>
       <w:r>
         <w:rPr>
-          <w:rFonts w:hint="default" w:ascii="Arial" w:hAnsi="Arial" w:eastAsia="Times New Roman"/>
-          <w:b/>
-          <w:bCs/>
-          <w:color w:val="C00000"/>
-        </w:rPr>
-        <w:t>Gean Lucas Teco Pfefer</w:t>
-      </w:r>
-      <w:r>
-        <w:rPr>
-          <w:rFonts w:hint="default" w:ascii="Arial" w:hAnsi="Arial" w:eastAsia="Times New Roman"/>
+          <w:rFonts w:hint="default" w:ascii="Arial" w:hAnsi="Arial" w:eastAsia="Times New Roman" w:cs="Times New Roman"/>
           <w:b/>
           <w:bCs/>
           <w:color w:val="C00000"/>
           <w:lang w:val="pt-BR"/>
         </w:rPr>
-        <w:t xml:space="preserve"> - RM88138</w:t>
+        <w:t xml:space="preserve"> Matheus Cavalcanti Rebola - RM81030</w:t>
       </w:r>
     </w:p>
     <w:p>
@@ -10647,11 +10657,23 @@
       <w:r>
         <w:rPr>
           <w:rFonts w:ascii="Arial" w:hAnsi="Arial" w:eastAsia="Times New Roman" w:cs="Arial"/>
-          <w:bCs/>
-          <w:sz w:val="20"/>
-          <w:szCs w:val="20"/>
-        </w:rPr>
-        <w:t>Os equipamentos poderão ser inseridos na topologia em qualquer posição à escolha da equipe (CUIDADO: esse é o momento de apresentar uma proposta exclusiva de sua equipe. EVITEM PLÁGIO!)</w:t>
+          <w:b/>
+          <w:bCs w:val="0"/>
+          <w:i/>
+          <w:iCs/>
+          <w:sz w:val="20"/>
+          <w:szCs w:val="20"/>
+        </w:rPr>
+        <w:t>Os equipamentos poderão ser inseridos na topologia em qualquer posição à escolha da equipe</w:t>
+      </w:r>
+      <w:r>
+        <w:rPr>
+          <w:rFonts w:ascii="Arial" w:hAnsi="Arial" w:eastAsia="Times New Roman" w:cs="Arial"/>
+          <w:bCs/>
+          <w:sz w:val="20"/>
+          <w:szCs w:val="20"/>
+        </w:rPr>
+        <w:t xml:space="preserve"> (CUIDADO: esse é o momento de apresentar uma proposta exclusiva de sua equipe. EVITEM PLÁGIO!)</w:t>
       </w:r>
     </w:p>
     <w:p>
@@ -10702,21 +10724,6 @@
     <w:p>
       <w:pPr>
         <w:rPr>
-          <w:rFonts w:hint="default"/>
-          <w:lang w:val="pt-BR"/>
-        </w:rPr>
-      </w:pPr>
-      <w:r>
-        <w:rPr>
-          <w:rFonts w:hint="default"/>
-          <w:lang w:val="pt-BR"/>
-        </w:rPr>
-        <w:t>Obs.: Configuração ainda não terminada no PacketTracer.</w:t>
-      </w:r>
-    </w:p>
-    <w:p>
-      <w:pPr>
-        <w:rPr>
           <w:rFonts w:ascii="Arial" w:hAnsi="Arial" w:eastAsia="Times New Roman" w:cs="Arial"/>
           <w:b/>
           <w:sz w:val="20"/>
@@ -11578,18 +11585,18 @@
       <w:pPr>
         <w:rPr>
           <w:rFonts w:ascii="Arial" w:hAnsi="Arial" w:eastAsia="Times New Roman" w:cs="Arial"/>
-          <w:bCs/>
-          <w:sz w:val="20"/>
-          <w:szCs w:val="20"/>
-        </w:rPr>
-      </w:pPr>
-      <w:r>
-        <w:rPr>
-          <w:rFonts w:ascii="Arial" w:hAnsi="Arial" w:eastAsia="Times New Roman" w:cs="Arial"/>
           <w:b/>
           <w:sz w:val="20"/>
           <w:szCs w:val="20"/>
         </w:rPr>
+      </w:pPr>
+      <w:r>
+        <w:rPr>
+          <w:rFonts w:ascii="Arial" w:hAnsi="Arial" w:eastAsia="Times New Roman" w:cs="Arial"/>
+          <w:b/>
+          <w:sz w:val="20"/>
+          <w:szCs w:val="20"/>
+        </w:rPr>
         <w:t>Atividade 6 (2 pontos).</w:t>
       </w:r>
       <w:r>
@@ -11601,16 +11608,6 @@
         </w:rPr>
         <w:t xml:space="preserve"> Apresente a descrição de 3 regras de uma política de segurança a ser implementado na topologia. Sigam o exemplo a seguir:</w:t>
       </w:r>
-    </w:p>
-    <w:p>
-      <w:pPr>
-        <w:rPr>
-          <w:rFonts w:ascii="Arial" w:hAnsi="Arial" w:eastAsia="Times New Roman" w:cs="Arial"/>
-          <w:b/>
-          <w:sz w:val="20"/>
-          <w:szCs w:val="20"/>
-        </w:rPr>
-      </w:pPr>
     </w:p>
     <w:p>
       <w:pPr>
@@ -11679,704 +11676,625 @@
         </w:rPr>
         <w:t xml:space="preserve"> </w:t>
       </w:r>
+      <w:r>
+        <w:rPr>
+          <w:rFonts w:hint="default" w:ascii="Arial" w:hAnsi="Arial" w:eastAsia="Times New Roman" w:cs="Arial"/>
+          <w:bCs/>
+          <w:sz w:val="20"/>
+          <w:szCs w:val="20"/>
+          <w:lang w:val="pt-BR"/>
+        </w:rPr>
+        <w:t>Os departamentos devem estar separados em VLANs.</w:t>
+      </w:r>
+    </w:p>
+    <w:p>
+      <w:pPr>
+        <w:rPr>
+          <w:rFonts w:ascii="Arial" w:hAnsi="Arial" w:eastAsia="Times New Roman" w:cs="Arial"/>
+          <w:bCs/>
+          <w:sz w:val="20"/>
+          <w:szCs w:val="20"/>
+        </w:rPr>
+      </w:pPr>
+    </w:p>
+    <w:p>
+      <w:pPr>
+        <w:rPr>
+          <w:rFonts w:hint="default" w:ascii="Arial" w:hAnsi="Arial" w:eastAsia="Times New Roman" w:cs="Arial"/>
+          <w:bCs/>
+          <w:sz w:val="20"/>
+          <w:szCs w:val="20"/>
+          <w:lang w:val="pt-BR"/>
+        </w:rPr>
+      </w:pPr>
+      <w:r>
+        <w:rPr>
+          <w:rFonts w:ascii="Arial" w:hAnsi="Arial" w:eastAsia="Times New Roman" w:cs="Arial"/>
+          <w:b/>
+          <w:sz w:val="20"/>
+          <w:szCs w:val="20"/>
+        </w:rPr>
+        <w:t>Regra 2:</w:t>
+      </w:r>
+      <w:r>
+        <w:rPr>
+          <w:rFonts w:ascii="Arial" w:hAnsi="Arial" w:eastAsia="Times New Roman" w:cs="Arial"/>
+          <w:bCs/>
+          <w:sz w:val="20"/>
+          <w:szCs w:val="20"/>
+        </w:rPr>
+        <w:t xml:space="preserve"> </w:t>
+      </w:r>
+      <w:r>
+        <w:rPr>
+          <w:rFonts w:hint="default" w:ascii="Arial" w:hAnsi="Arial" w:eastAsia="Times New Roman" w:cs="Arial"/>
+          <w:bCs/>
+          <w:sz w:val="20"/>
+          <w:szCs w:val="20"/>
+          <w:lang w:val="pt-BR"/>
+        </w:rPr>
+        <w:t xml:space="preserve">Os departamentos devem estar separados em ACLs, definidos por hierarquia. Por exemplo: </w:t>
+      </w:r>
+    </w:p>
+    <w:p>
+      <w:pPr>
+        <w:rPr>
+          <w:rFonts w:hint="default" w:ascii="Arial" w:hAnsi="Arial" w:eastAsia="Times New Roman" w:cs="Arial"/>
+          <w:bCs/>
+          <w:sz w:val="20"/>
+          <w:szCs w:val="20"/>
+          <w:lang w:val="pt-BR"/>
+        </w:rPr>
+      </w:pPr>
+      <w:r>
+        <w:rPr>
+          <w:rFonts w:hint="default" w:ascii="Arial" w:hAnsi="Arial" w:eastAsia="Times New Roman" w:cs="Arial"/>
+          <w:bCs/>
+          <w:sz w:val="20"/>
+          <w:szCs w:val="20"/>
+          <w:lang w:val="pt-BR"/>
+        </w:rPr>
+        <w:t xml:space="preserve">- Diretoria deve ter acesso à qualquer área da empresa; </w:t>
+      </w:r>
+    </w:p>
+    <w:p>
+      <w:pPr>
+        <w:rPr>
+          <w:rFonts w:hint="default" w:ascii="Arial" w:hAnsi="Arial" w:eastAsia="Times New Roman" w:cs="Arial"/>
+          <w:bCs/>
+          <w:sz w:val="20"/>
+          <w:szCs w:val="20"/>
+          <w:lang w:val="pt-BR"/>
+        </w:rPr>
+      </w:pPr>
+      <w:r>
+        <w:rPr>
+          <w:rFonts w:hint="default" w:ascii="Arial" w:hAnsi="Arial" w:eastAsia="Times New Roman" w:cs="Arial"/>
+          <w:bCs/>
+          <w:sz w:val="20"/>
+          <w:szCs w:val="20"/>
+          <w:lang w:val="pt-BR"/>
+        </w:rPr>
+        <w:t>- Vendas pode ter acesso ao SAC e vice-versa, além de possuírem acesso aos Servidores;</w:t>
+      </w:r>
+    </w:p>
+    <w:p>
+      <w:pPr>
+        <w:rPr>
+          <w:rFonts w:hint="default" w:ascii="Arial" w:hAnsi="Arial" w:eastAsia="Times New Roman" w:cs="Arial"/>
+          <w:bCs/>
+          <w:sz w:val="20"/>
+          <w:szCs w:val="20"/>
+          <w:lang w:val="pt-BR"/>
+        </w:rPr>
+      </w:pPr>
+      <w:r>
+        <w:rPr>
+          <w:rFonts w:hint="default" w:ascii="Arial" w:hAnsi="Arial" w:eastAsia="Times New Roman" w:cs="Arial"/>
+          <w:bCs/>
+          <w:sz w:val="20"/>
+          <w:szCs w:val="20"/>
+          <w:lang w:val="pt-BR"/>
+        </w:rPr>
+        <w:t>- Projeto e Inovação devem ter acesso à todas as áreas menos à diretoria;</w:t>
+      </w:r>
+    </w:p>
+    <w:p>
+      <w:pPr>
+        <w:rPr>
+          <w:rFonts w:hint="default" w:ascii="Arial" w:hAnsi="Arial" w:eastAsia="Times New Roman" w:cs="Arial"/>
+          <w:bCs/>
+          <w:sz w:val="20"/>
+          <w:szCs w:val="20"/>
+          <w:lang w:val="pt-BR"/>
+        </w:rPr>
+      </w:pPr>
+      <w:r>
+        <w:rPr>
+          <w:rFonts w:hint="default" w:ascii="Arial" w:hAnsi="Arial" w:eastAsia="Times New Roman" w:cs="Arial"/>
+          <w:bCs/>
+          <w:sz w:val="20"/>
+          <w:szCs w:val="20"/>
+          <w:lang w:val="pt-BR"/>
+        </w:rPr>
+        <w:t>- Design deve ter acesso apenas a sua VLAN, e aos servidores;</w:t>
+      </w:r>
+    </w:p>
+    <w:p>
+      <w:pPr>
+        <w:rPr>
+          <w:rFonts w:hint="default" w:ascii="Arial" w:hAnsi="Arial" w:eastAsia="Times New Roman" w:cs="Arial"/>
+          <w:bCs/>
+          <w:sz w:val="20"/>
+          <w:szCs w:val="20"/>
+          <w:lang w:val="pt-BR"/>
+        </w:rPr>
+      </w:pPr>
+      <w:r>
+        <w:rPr>
+          <w:rFonts w:hint="default" w:ascii="Arial" w:hAnsi="Arial" w:eastAsia="Times New Roman" w:cs="Arial"/>
+          <w:bCs/>
+          <w:sz w:val="20"/>
+          <w:szCs w:val="20"/>
+          <w:lang w:val="pt-BR"/>
+        </w:rPr>
+        <w:t>Obs.: Todos devem ter acesso à Internet.</w:t>
+      </w:r>
+    </w:p>
+    <w:p>
+      <w:pPr>
+        <w:rPr>
+          <w:rFonts w:ascii="Arial" w:hAnsi="Arial" w:eastAsia="Times New Roman" w:cs="Arial"/>
+          <w:b/>
+          <w:sz w:val="20"/>
+          <w:szCs w:val="20"/>
+        </w:rPr>
+      </w:pPr>
+    </w:p>
+    <w:p>
+      <w:pPr>
+        <w:rPr>
+          <w:rFonts w:hint="default" w:ascii="Arial" w:hAnsi="Arial" w:eastAsia="Times New Roman" w:cs="Arial"/>
+          <w:b/>
+          <w:sz w:val="20"/>
+          <w:szCs w:val="20"/>
+          <w:lang w:val="pt-BR"/>
+        </w:rPr>
+      </w:pPr>
+      <w:r>
+        <w:rPr>
+          <w:rFonts w:ascii="Arial" w:hAnsi="Arial" w:eastAsia="Times New Roman" w:cs="Arial"/>
+          <w:b/>
+          <w:sz w:val="20"/>
+          <w:szCs w:val="20"/>
+        </w:rPr>
+        <w:t>Regra 3:</w:t>
+      </w:r>
+      <w:r>
+        <w:rPr>
+          <w:rFonts w:ascii="Arial" w:hAnsi="Arial" w:eastAsia="Times New Roman" w:cs="Arial"/>
+          <w:bCs/>
+          <w:sz w:val="20"/>
+          <w:szCs w:val="20"/>
+        </w:rPr>
+        <w:t xml:space="preserve"> </w:t>
+      </w:r>
+      <w:r>
+        <w:rPr>
+          <w:rFonts w:hint="default" w:ascii="Arial" w:hAnsi="Arial" w:eastAsia="Times New Roman" w:cs="Arial"/>
+          <w:bCs/>
+          <w:sz w:val="20"/>
+          <w:szCs w:val="20"/>
+          <w:lang w:val="pt-BR"/>
+        </w:rPr>
+        <w:t>Liberar acessos vindos da Internet apenas para o servidor Público e apenas a HTTP.</w:t>
+      </w:r>
+    </w:p>
+    <w:p>
+      <w:pPr>
+        <w:rPr>
+          <w:rFonts w:ascii="Arial" w:hAnsi="Arial" w:eastAsia="Times New Roman" w:cs="Arial"/>
+          <w:b/>
+          <w:sz w:val="20"/>
+          <w:szCs w:val="20"/>
+        </w:rPr>
+      </w:pPr>
+      <w:r>
+        <w:rPr>
+          <w:rFonts w:ascii="Arial" w:hAnsi="Arial" w:eastAsia="Times New Roman" w:cs="Arial"/>
+          <w:b/>
+          <w:sz w:val="20"/>
+          <w:szCs w:val="20"/>
+        </w:rPr>
+        <w:br w:type="page"/>
+      </w:r>
+    </w:p>
+    <w:p>
+      <w:pPr>
+        <w:rPr>
+          <w:rFonts w:ascii="Arial" w:hAnsi="Arial" w:eastAsia="Times New Roman" w:cs="Arial"/>
+          <w:b/>
+          <w:sz w:val="20"/>
+          <w:szCs w:val="20"/>
+        </w:rPr>
+      </w:pPr>
+    </w:p>
+    <w:p>
+      <w:pPr>
+        <w:rPr>
+          <w:rFonts w:ascii="Arial" w:hAnsi="Arial" w:eastAsia="Times New Roman" w:cs="Arial"/>
+          <w:bCs/>
+          <w:sz w:val="20"/>
+          <w:szCs w:val="20"/>
+        </w:rPr>
+      </w:pPr>
+      <w:r>
+        <w:rPr>
+          <w:rFonts w:ascii="Arial" w:hAnsi="Arial" w:eastAsia="Times New Roman" w:cs="Arial"/>
+          <w:b/>
+          <w:sz w:val="20"/>
+          <w:szCs w:val="20"/>
+        </w:rPr>
+        <w:t>Atividade 7 (2 pontos).</w:t>
+      </w:r>
+      <w:r>
+        <w:rPr>
+          <w:rFonts w:ascii="Arial" w:hAnsi="Arial" w:eastAsia="Times New Roman" w:cs="Arial"/>
+          <w:bCs/>
+          <w:sz w:val="20"/>
+          <w:szCs w:val="20"/>
+        </w:rPr>
+        <w:t xml:space="preserve"> Apresente os comandos para implantação das regras da política de segurança proposta por sua equipe na atividade 6.</w:t>
+      </w:r>
+    </w:p>
+    <w:p>
+      <w:pPr>
+        <w:rPr>
+          <w:rFonts w:ascii="Arial" w:hAnsi="Arial" w:eastAsia="Times New Roman" w:cs="Arial"/>
+          <w:bCs/>
+          <w:sz w:val="20"/>
+          <w:szCs w:val="20"/>
+        </w:rPr>
+      </w:pPr>
+    </w:p>
+    <w:p>
+      <w:pPr>
+        <w:rPr>
+          <w:rFonts w:ascii="Arial" w:hAnsi="Arial" w:eastAsia="Times New Roman" w:cs="Arial"/>
+          <w:bCs/>
+          <w:sz w:val="20"/>
+          <w:szCs w:val="20"/>
+        </w:rPr>
+      </w:pPr>
+      <w:r>
+        <w:rPr>
+          <w:rFonts w:ascii="Arial" w:hAnsi="Arial" w:eastAsia="Times New Roman" w:cs="Arial"/>
+          <w:b/>
+          <w:sz w:val="20"/>
+          <w:szCs w:val="20"/>
+        </w:rPr>
+        <w:t>Regra 1:</w:t>
+      </w:r>
+      <w:r>
+        <w:rPr>
+          <w:rFonts w:ascii="Arial" w:hAnsi="Arial" w:eastAsia="Times New Roman" w:cs="Arial"/>
+          <w:bCs/>
+          <w:sz w:val="20"/>
+          <w:szCs w:val="20"/>
+        </w:rPr>
+        <w:t xml:space="preserve"> Preencha o espaço a seguir com TODOS os comandos para implementar a regra 1 da política de segurança proposta por sua equipe na atividade 6.</w:t>
+      </w:r>
+    </w:p>
+    <w:p>
+      <w:pPr>
+        <w:rPr>
+          <w:rFonts w:hint="default" w:ascii="Arial" w:hAnsi="Arial" w:eastAsia="Times New Roman" w:cs="Arial"/>
+          <w:bCs/>
+          <w:sz w:val="20"/>
+          <w:szCs w:val="20"/>
+          <w:lang w:val="pt-BR"/>
+        </w:rPr>
+      </w:pPr>
+      <w:r>
+        <w:rPr>
+          <w:rFonts w:hint="default" w:ascii="Arial" w:hAnsi="Arial" w:eastAsia="Times New Roman" w:cs="Arial"/>
+          <w:b/>
+          <w:bCs w:val="0"/>
+          <w:sz w:val="20"/>
+          <w:szCs w:val="20"/>
+          <w:lang w:val="pt-BR"/>
+        </w:rPr>
+        <w:t>R.:</w:t>
+      </w:r>
+      <w:r>
+        <w:rPr>
+          <w:rFonts w:hint="default" w:ascii="Arial" w:hAnsi="Arial" w:eastAsia="Times New Roman" w:cs="Arial"/>
+          <w:bCs/>
+          <w:sz w:val="20"/>
+          <w:szCs w:val="20"/>
+          <w:lang w:val="pt-BR"/>
+        </w:rPr>
+        <w:t xml:space="preserve"> Já foi criada na Atividade 5.</w:t>
+      </w:r>
+    </w:p>
+    <w:p>
+      <w:pPr>
+        <w:rPr>
+          <w:rFonts w:ascii="Arial" w:hAnsi="Arial" w:eastAsia="Times New Roman" w:cs="Arial"/>
+          <w:bCs/>
+          <w:sz w:val="20"/>
+          <w:szCs w:val="20"/>
+        </w:rPr>
+      </w:pPr>
+    </w:p>
+    <w:p>
+      <w:pPr>
+        <w:rPr>
+          <w:rFonts w:ascii="Arial" w:hAnsi="Arial" w:eastAsia="Times New Roman" w:cs="Arial"/>
+          <w:bCs/>
+          <w:sz w:val="20"/>
+          <w:szCs w:val="20"/>
+        </w:rPr>
+      </w:pPr>
+    </w:p>
+    <w:p>
+      <w:pPr>
+        <w:rPr>
+          <w:rFonts w:ascii="Arial" w:hAnsi="Arial" w:eastAsia="Times New Roman" w:cs="Arial"/>
+          <w:bCs/>
+          <w:sz w:val="20"/>
+          <w:szCs w:val="20"/>
+        </w:rPr>
+      </w:pPr>
+      <w:r>
+        <w:rPr>
+          <w:rFonts w:ascii="Arial" w:hAnsi="Arial" w:eastAsia="Times New Roman" w:cs="Arial"/>
+          <w:b/>
+          <w:sz w:val="20"/>
+          <w:szCs w:val="20"/>
+        </w:rPr>
+        <w:t>Regra 2:</w:t>
+      </w:r>
+      <w:r>
+        <w:rPr>
+          <w:rFonts w:ascii="Arial" w:hAnsi="Arial" w:eastAsia="Times New Roman" w:cs="Arial"/>
+          <w:bCs/>
+          <w:sz w:val="20"/>
+          <w:szCs w:val="20"/>
+        </w:rPr>
+        <w:t xml:space="preserve"> Preencha o espaço a seguir com TODOS os comandos para implementar a regra 2 da política de segurança proposta por sua equipe na atividade 6.</w:t>
+      </w:r>
+    </w:p>
+    <w:p>
+      <w:pPr>
+        <w:rPr>
+          <w:rFonts w:ascii="Arial" w:hAnsi="Arial" w:eastAsia="Times New Roman" w:cs="Arial"/>
+          <w:b/>
+          <w:sz w:val="20"/>
+          <w:szCs w:val="20"/>
+        </w:rPr>
+      </w:pPr>
+      <w:r>
+        <w:rPr>
+          <w:rFonts w:ascii="Arial" w:hAnsi="Arial" w:eastAsia="Times New Roman" w:cs="Arial"/>
+          <w:bCs/>
+          <w:color w:val="C00000"/>
+          <w:sz w:val="20"/>
+          <w:szCs w:val="20"/>
+          <w:highlight w:val="yellow"/>
+        </w:rPr>
+        <w:t>&lt;preencha aqui&gt;</w:t>
+      </w:r>
+    </w:p>
+    <w:p>
+      <w:pPr>
+        <w:rPr>
+          <w:rFonts w:ascii="Arial" w:hAnsi="Arial" w:eastAsia="Times New Roman" w:cs="Arial"/>
+          <w:b/>
+          <w:sz w:val="20"/>
+          <w:szCs w:val="20"/>
+        </w:rPr>
+      </w:pPr>
+    </w:p>
+    <w:p>
+      <w:pPr>
+        <w:rPr>
+          <w:rFonts w:ascii="Arial" w:hAnsi="Arial" w:eastAsia="Times New Roman" w:cs="Arial"/>
+          <w:b/>
+          <w:sz w:val="20"/>
+          <w:szCs w:val="20"/>
+        </w:rPr>
+      </w:pPr>
+    </w:p>
+    <w:p>
+      <w:pPr>
+        <w:rPr>
+          <w:rFonts w:ascii="Arial" w:hAnsi="Arial" w:eastAsia="Times New Roman" w:cs="Arial"/>
+          <w:b/>
+          <w:sz w:val="20"/>
+          <w:szCs w:val="20"/>
+        </w:rPr>
+      </w:pPr>
+    </w:p>
+    <w:p>
+      <w:pPr>
+        <w:rPr>
+          <w:rFonts w:ascii="Arial" w:hAnsi="Arial" w:eastAsia="Times New Roman" w:cs="Arial"/>
+          <w:b/>
+          <w:sz w:val="20"/>
+          <w:szCs w:val="20"/>
+        </w:rPr>
+      </w:pPr>
+    </w:p>
+    <w:p>
+      <w:pPr>
+        <w:rPr>
+          <w:rFonts w:ascii="Arial" w:hAnsi="Arial" w:eastAsia="Times New Roman" w:cs="Arial"/>
+          <w:bCs/>
+          <w:sz w:val="20"/>
+          <w:szCs w:val="20"/>
+        </w:rPr>
+      </w:pPr>
+      <w:r>
+        <w:rPr>
+          <w:rFonts w:ascii="Arial" w:hAnsi="Arial" w:eastAsia="Times New Roman" w:cs="Arial"/>
+          <w:b/>
+          <w:sz w:val="20"/>
+          <w:szCs w:val="20"/>
+        </w:rPr>
+        <w:t>Regra 3:</w:t>
+      </w:r>
+      <w:r>
+        <w:rPr>
+          <w:rFonts w:ascii="Arial" w:hAnsi="Arial" w:eastAsia="Times New Roman" w:cs="Arial"/>
+          <w:bCs/>
+          <w:sz w:val="20"/>
+          <w:szCs w:val="20"/>
+        </w:rPr>
+        <w:t xml:space="preserve"> Preencha o espaço a seguir com TODOS os comandos para implementar a regra 3 da política de segurança proposta por sua equipe na atividade 6.</w:t>
+      </w:r>
+    </w:p>
+    <w:p>
+      <w:pPr>
+        <w:rPr>
+          <w:rFonts w:ascii="Arial" w:hAnsi="Arial" w:eastAsia="Times New Roman" w:cs="Arial"/>
+          <w:b/>
+          <w:sz w:val="20"/>
+          <w:szCs w:val="20"/>
+        </w:rPr>
+      </w:pPr>
+      <w:r>
+        <w:rPr>
+          <w:rFonts w:ascii="Arial" w:hAnsi="Arial" w:eastAsia="Times New Roman" w:cs="Arial"/>
+          <w:bCs/>
+          <w:color w:val="C00000"/>
+          <w:sz w:val="20"/>
+          <w:szCs w:val="20"/>
+          <w:highlight w:val="yellow"/>
+        </w:rPr>
+        <w:t>&lt;preencha aqui&gt;</w:t>
+      </w:r>
+    </w:p>
+    <w:p>
+      <w:pPr>
+        <w:rPr>
+          <w:rFonts w:ascii="Arial" w:hAnsi="Arial" w:eastAsia="Times New Roman" w:cs="Arial"/>
+          <w:b/>
+          <w:sz w:val="20"/>
+          <w:szCs w:val="20"/>
+        </w:rPr>
+      </w:pPr>
+    </w:p>
+    <w:p>
+      <w:pPr>
+        <w:rPr>
+          <w:rFonts w:ascii="Arial" w:hAnsi="Arial" w:eastAsia="Times New Roman" w:cs="Arial"/>
+          <w:b/>
+          <w:sz w:val="20"/>
+          <w:szCs w:val="20"/>
+        </w:rPr>
+      </w:pPr>
+    </w:p>
+    <w:p>
+      <w:pPr>
+        <w:rPr>
+          <w:rFonts w:ascii="Arial" w:hAnsi="Arial" w:eastAsia="Times New Roman" w:cs="Arial"/>
+          <w:b/>
+          <w:sz w:val="20"/>
+          <w:szCs w:val="20"/>
+        </w:rPr>
+      </w:pPr>
+    </w:p>
+    <w:p>
+      <w:pPr>
+        <w:rPr>
+          <w:rFonts w:ascii="Arial" w:hAnsi="Arial" w:eastAsia="Times New Roman" w:cs="Arial"/>
+          <w:b/>
+          <w:sz w:val="20"/>
+          <w:szCs w:val="20"/>
+        </w:rPr>
+      </w:pPr>
+    </w:p>
+    <w:p>
+      <w:pPr>
+        <w:rPr>
+          <w:rFonts w:ascii="Arial" w:hAnsi="Arial" w:eastAsia="Times New Roman" w:cs="Arial"/>
+          <w:b/>
+          <w:sz w:val="20"/>
+          <w:szCs w:val="20"/>
+        </w:rPr>
+      </w:pPr>
+    </w:p>
+    <w:p>
+      <w:pPr>
+        <w:rPr>
+          <w:rFonts w:ascii="Arial" w:hAnsi="Arial" w:eastAsia="Times New Roman" w:cs="Arial"/>
+          <w:b/>
+          <w:sz w:val="20"/>
+          <w:szCs w:val="20"/>
+        </w:rPr>
+      </w:pPr>
+    </w:p>
+    <w:p>
+      <w:pPr>
+        <w:rPr>
+          <w:rFonts w:ascii="Arial" w:hAnsi="Arial" w:eastAsia="Times New Roman" w:cs="Arial"/>
+          <w:bCs/>
+          <w:sz w:val="20"/>
+          <w:szCs w:val="20"/>
+        </w:rPr>
+      </w:pPr>
+      <w:r>
+        <w:rPr>
+          <w:rFonts w:ascii="Arial" w:hAnsi="Arial" w:eastAsia="Times New Roman" w:cs="Arial"/>
+          <w:b/>
+          <w:sz w:val="20"/>
+          <w:szCs w:val="20"/>
+        </w:rPr>
+        <w:t xml:space="preserve">Atividade 8 (1 ponto). </w:t>
+      </w:r>
+      <w:r>
+        <w:rPr>
+          <w:rFonts w:ascii="Arial" w:hAnsi="Arial" w:eastAsia="Times New Roman" w:cs="Arial"/>
+          <w:bCs/>
+          <w:sz w:val="20"/>
+          <w:szCs w:val="20"/>
+        </w:rPr>
+        <w:t>Apresente os comandos necessários para configurar roteamento RIP no roteador existente.</w:t>
+      </w:r>
+    </w:p>
+    <w:p>
+      <w:pPr>
+        <w:rPr>
+          <w:rFonts w:ascii="Arial" w:hAnsi="Arial" w:eastAsia="Times New Roman" w:cs="Arial"/>
+          <w:b/>
+          <w:sz w:val="20"/>
+          <w:szCs w:val="20"/>
+        </w:rPr>
+      </w:pPr>
+      <w:r>
+        <w:rPr>
+          <w:rFonts w:hint="default" w:ascii="Arial" w:hAnsi="Arial" w:eastAsia="Times New Roman" w:cs="Arial"/>
+          <w:b/>
+          <w:bCs w:val="0"/>
+          <w:sz w:val="20"/>
+          <w:szCs w:val="20"/>
+          <w:lang w:val="pt-BR"/>
+        </w:rPr>
+        <w:t>R.:</w:t>
+      </w:r>
+      <w:r>
+        <w:rPr>
+          <w:rFonts w:hint="default" w:ascii="Arial" w:hAnsi="Arial" w:eastAsia="Times New Roman" w:cs="Arial"/>
+          <w:bCs/>
+          <w:sz w:val="20"/>
+          <w:szCs w:val="20"/>
+          <w:lang w:val="pt-BR"/>
+        </w:rPr>
+        <w:t xml:space="preserve"> Não parece haver necessidade de configuração de RIP na topologia descrita pois há apenas um Router.</w:t>
+      </w:r>
       <w:bookmarkStart w:id="0" w:name="_GoBack"/>
       <w:bookmarkEnd w:id="0"/>
-      <w:r>
-        <w:rPr>
-          <w:rFonts w:hint="default" w:ascii="Arial" w:hAnsi="Arial" w:eastAsia="Times New Roman" w:cs="Arial"/>
-          <w:bCs/>
-          <w:sz w:val="20"/>
-          <w:szCs w:val="20"/>
-          <w:lang w:val="pt-BR"/>
-        </w:rPr>
-        <w:t xml:space="preserve">Os departamentos devem estar separados em redes (VLANs) e com acessos restritos, definidos por hierarquia. Por exemplo: </w:t>
-      </w:r>
-    </w:p>
-    <w:p>
-      <w:pPr>
-        <w:rPr>
-          <w:rFonts w:hint="default" w:ascii="Arial" w:hAnsi="Arial" w:eastAsia="Times New Roman" w:cs="Arial"/>
-          <w:bCs/>
-          <w:sz w:val="20"/>
-          <w:szCs w:val="20"/>
-          <w:lang w:val="pt-BR"/>
-        </w:rPr>
-      </w:pPr>
-      <w:r>
-        <w:rPr>
-          <w:rFonts w:hint="default" w:ascii="Arial" w:hAnsi="Arial" w:eastAsia="Times New Roman" w:cs="Arial"/>
-          <w:bCs/>
-          <w:sz w:val="20"/>
-          <w:szCs w:val="20"/>
-          <w:lang w:val="pt-BR"/>
-        </w:rPr>
-        <w:t xml:space="preserve">- Diretoria deve ter acesso à qualquer área da empresa; </w:t>
-      </w:r>
-    </w:p>
-    <w:p>
-      <w:pPr>
-        <w:rPr>
-          <w:rFonts w:hint="default" w:ascii="Arial" w:hAnsi="Arial" w:eastAsia="Times New Roman" w:cs="Arial"/>
-          <w:bCs/>
-          <w:sz w:val="20"/>
-          <w:szCs w:val="20"/>
-          <w:lang w:val="pt-BR"/>
-        </w:rPr>
-      </w:pPr>
-      <w:r>
-        <w:rPr>
-          <w:rFonts w:hint="default" w:ascii="Arial" w:hAnsi="Arial" w:eastAsia="Times New Roman" w:cs="Arial"/>
-          <w:bCs/>
-          <w:sz w:val="20"/>
-          <w:szCs w:val="20"/>
-          <w:lang w:val="pt-BR"/>
-        </w:rPr>
-        <w:t>- Vendas pode ter acesso ao SAC e vice-versa, além de possuírem acesso aos Servidores;</w:t>
-      </w:r>
-    </w:p>
-    <w:p>
-      <w:pPr>
-        <w:rPr>
-          <w:rFonts w:hint="default" w:ascii="Arial" w:hAnsi="Arial" w:eastAsia="Times New Roman" w:cs="Arial"/>
-          <w:bCs/>
-          <w:sz w:val="20"/>
-          <w:szCs w:val="20"/>
-          <w:lang w:val="pt-BR"/>
-        </w:rPr>
-      </w:pPr>
-      <w:r>
-        <w:rPr>
-          <w:rFonts w:hint="default" w:ascii="Arial" w:hAnsi="Arial" w:eastAsia="Times New Roman" w:cs="Arial"/>
-          <w:bCs/>
-          <w:sz w:val="20"/>
-          <w:szCs w:val="20"/>
-          <w:lang w:val="pt-BR"/>
-        </w:rPr>
-        <w:t>- Projeto e Inovação devem ter acesso à todas as áreas menos à diretoria;</w:t>
-      </w:r>
-    </w:p>
-    <w:p>
-      <w:pPr>
-        <w:rPr>
-          <w:rFonts w:hint="default" w:ascii="Arial" w:hAnsi="Arial" w:eastAsia="Times New Roman" w:cs="Arial"/>
-          <w:bCs/>
-          <w:sz w:val="20"/>
-          <w:szCs w:val="20"/>
-          <w:lang w:val="pt-BR"/>
-        </w:rPr>
-      </w:pPr>
-      <w:r>
-        <w:rPr>
-          <w:rFonts w:hint="default" w:ascii="Arial" w:hAnsi="Arial" w:eastAsia="Times New Roman" w:cs="Arial"/>
-          <w:bCs/>
-          <w:sz w:val="20"/>
-          <w:szCs w:val="20"/>
-          <w:lang w:val="pt-BR"/>
-        </w:rPr>
-        <w:t>- Design deve ter acesso apenas a sua VLAN, e aos servidores;</w:t>
-      </w:r>
-    </w:p>
-    <w:p>
-      <w:pPr>
-        <w:rPr>
-          <w:rFonts w:hint="default" w:ascii="Arial" w:hAnsi="Arial" w:eastAsia="Times New Roman" w:cs="Arial"/>
-          <w:bCs/>
-          <w:sz w:val="20"/>
-          <w:szCs w:val="20"/>
-          <w:lang w:val="pt-BR"/>
-        </w:rPr>
-      </w:pPr>
-      <w:r>
-        <w:rPr>
-          <w:rFonts w:hint="default" w:ascii="Arial" w:hAnsi="Arial" w:eastAsia="Times New Roman" w:cs="Arial"/>
-          <w:bCs/>
-          <w:sz w:val="20"/>
-          <w:szCs w:val="20"/>
-          <w:lang w:val="pt-BR"/>
-        </w:rPr>
-        <w:t>Obs.: Todos devem acessar a internet.</w:t>
-      </w:r>
-    </w:p>
-    <w:p>
-      <w:pPr>
-        <w:rPr>
-          <w:rFonts w:ascii="Arial" w:hAnsi="Arial" w:eastAsia="Times New Roman" w:cs="Arial"/>
-          <w:bCs/>
-          <w:sz w:val="20"/>
-          <w:szCs w:val="20"/>
-        </w:rPr>
-      </w:pPr>
-    </w:p>
-    <w:p>
-      <w:pPr>
-        <w:rPr>
-          <w:rFonts w:ascii="Arial" w:hAnsi="Arial" w:eastAsia="Times New Roman" w:cs="Arial"/>
-          <w:bCs/>
-          <w:sz w:val="20"/>
-          <w:szCs w:val="20"/>
-        </w:rPr>
-      </w:pPr>
-    </w:p>
-    <w:p>
-      <w:pPr>
-        <w:rPr>
-          <w:rFonts w:ascii="Arial" w:hAnsi="Arial" w:eastAsia="Times New Roman" w:cs="Arial"/>
-          <w:bCs/>
-          <w:sz w:val="20"/>
-          <w:szCs w:val="20"/>
-        </w:rPr>
-      </w:pPr>
-    </w:p>
-    <w:p>
-      <w:pPr>
-        <w:rPr>
-          <w:rFonts w:hint="default" w:ascii="Arial" w:hAnsi="Arial" w:eastAsia="Times New Roman" w:cs="Arial"/>
-          <w:bCs/>
-          <w:sz w:val="20"/>
-          <w:szCs w:val="20"/>
-          <w:lang w:val="pt-BR"/>
-        </w:rPr>
-      </w:pPr>
-      <w:r>
-        <w:rPr>
-          <w:rFonts w:ascii="Arial" w:hAnsi="Arial" w:eastAsia="Times New Roman" w:cs="Arial"/>
-          <w:b/>
-          <w:sz w:val="20"/>
-          <w:szCs w:val="20"/>
-        </w:rPr>
-        <w:t>Regra 2:</w:t>
-      </w:r>
-      <w:r>
-        <w:rPr>
-          <w:rFonts w:ascii="Arial" w:hAnsi="Arial" w:eastAsia="Times New Roman" w:cs="Arial"/>
-          <w:bCs/>
-          <w:sz w:val="20"/>
-          <w:szCs w:val="20"/>
-        </w:rPr>
-        <w:t xml:space="preserve"> </w:t>
-      </w:r>
-      <w:r>
-        <w:rPr>
-          <w:rFonts w:hint="default" w:ascii="Arial" w:hAnsi="Arial" w:eastAsia="Times New Roman" w:cs="Arial"/>
-          <w:bCs/>
-          <w:sz w:val="20"/>
-          <w:szCs w:val="20"/>
-          <w:lang w:val="pt-BR"/>
-        </w:rPr>
-        <w:t>Limitar acesso ao servidor da Intranet somente ao range de IP local.</w:t>
-      </w:r>
-    </w:p>
-    <w:p>
-      <w:pPr>
-        <w:rPr>
-          <w:rFonts w:ascii="Arial" w:hAnsi="Arial" w:eastAsia="Times New Roman" w:cs="Arial"/>
-          <w:b/>
-          <w:sz w:val="20"/>
-          <w:szCs w:val="20"/>
-        </w:rPr>
-      </w:pPr>
-    </w:p>
-    <w:p>
-      <w:pPr>
-        <w:rPr>
-          <w:rFonts w:ascii="Arial" w:hAnsi="Arial" w:eastAsia="Times New Roman" w:cs="Arial"/>
-          <w:bCs/>
-          <w:sz w:val="20"/>
-          <w:szCs w:val="20"/>
-        </w:rPr>
-      </w:pPr>
-      <w:r>
-        <w:rPr>
-          <w:rFonts w:ascii="Arial" w:hAnsi="Arial" w:eastAsia="Times New Roman" w:cs="Arial"/>
-          <w:b/>
-          <w:sz w:val="20"/>
-          <w:szCs w:val="20"/>
-        </w:rPr>
-        <w:t>Regra 3:</w:t>
-      </w:r>
-      <w:r>
-        <w:rPr>
-          <w:rFonts w:ascii="Arial" w:hAnsi="Arial" w:eastAsia="Times New Roman" w:cs="Arial"/>
-          <w:bCs/>
-          <w:sz w:val="20"/>
-          <w:szCs w:val="20"/>
-        </w:rPr>
-        <w:t xml:space="preserve"> Preencha o espaço a seguir com uma proposta de regra de uma política de segurança a ser implementada na topologia.</w:t>
-      </w:r>
-    </w:p>
-    <w:p>
-      <w:pPr>
-        <w:rPr>
-          <w:rFonts w:hint="default" w:ascii="Arial" w:hAnsi="Arial" w:eastAsia="Times New Roman" w:cs="Arial"/>
-          <w:b/>
-          <w:sz w:val="20"/>
-          <w:szCs w:val="20"/>
-          <w:lang w:val="pt-BR"/>
-        </w:rPr>
-      </w:pPr>
-      <w:r>
-        <w:rPr>
-          <w:rFonts w:hint="default" w:ascii="Arial" w:hAnsi="Arial" w:eastAsia="Times New Roman" w:cs="Arial"/>
-          <w:b/>
-          <w:sz w:val="20"/>
-          <w:szCs w:val="20"/>
-          <w:lang w:val="pt-BR"/>
-        </w:rPr>
-        <w:t>//necessita mais estudos</w:t>
-      </w:r>
-    </w:p>
-    <w:p>
-      <w:pPr>
-        <w:rPr>
-          <w:rFonts w:ascii="Arial" w:hAnsi="Arial" w:eastAsia="Times New Roman" w:cs="Arial"/>
-          <w:b/>
-          <w:sz w:val="20"/>
-          <w:szCs w:val="20"/>
-        </w:rPr>
-      </w:pPr>
-      <w:r>
-        <w:rPr>
-          <w:rFonts w:ascii="Arial" w:hAnsi="Arial" w:eastAsia="Times New Roman" w:cs="Arial"/>
-          <w:b/>
-          <w:sz w:val="20"/>
-          <w:szCs w:val="20"/>
-        </w:rPr>
-        <w:br w:type="page"/>
-      </w:r>
-    </w:p>
-    <w:p>
-      <w:pPr>
-        <w:rPr>
-          <w:rFonts w:ascii="Arial" w:hAnsi="Arial" w:eastAsia="Times New Roman" w:cs="Arial"/>
-          <w:b/>
-          <w:sz w:val="20"/>
-          <w:szCs w:val="20"/>
-        </w:rPr>
-      </w:pPr>
-    </w:p>
-    <w:p>
-      <w:pPr>
-        <w:rPr>
-          <w:rFonts w:ascii="Arial" w:hAnsi="Arial" w:eastAsia="Times New Roman" w:cs="Arial"/>
-          <w:bCs/>
-          <w:sz w:val="20"/>
-          <w:szCs w:val="20"/>
-        </w:rPr>
-      </w:pPr>
-      <w:r>
-        <w:rPr>
-          <w:rFonts w:ascii="Arial" w:hAnsi="Arial" w:eastAsia="Times New Roman" w:cs="Arial"/>
-          <w:b/>
-          <w:sz w:val="20"/>
-          <w:szCs w:val="20"/>
-        </w:rPr>
-        <w:t>Atividade 7 (2 pontos).</w:t>
-      </w:r>
-      <w:r>
-        <w:rPr>
-          <w:rFonts w:ascii="Arial" w:hAnsi="Arial" w:eastAsia="Times New Roman" w:cs="Arial"/>
-          <w:bCs/>
-          <w:sz w:val="20"/>
-          <w:szCs w:val="20"/>
-        </w:rPr>
-        <w:t xml:space="preserve"> Apresente os comandos para implantação das regras da política de segurança proposta por sua equipe na atividade 6.</w:t>
-      </w:r>
-    </w:p>
-    <w:p>
-      <w:pPr>
-        <w:rPr>
-          <w:rFonts w:ascii="Arial" w:hAnsi="Arial" w:eastAsia="Times New Roman" w:cs="Arial"/>
-          <w:bCs/>
-          <w:sz w:val="20"/>
-          <w:szCs w:val="20"/>
-        </w:rPr>
-      </w:pPr>
-    </w:p>
-    <w:p>
-      <w:pPr>
-        <w:rPr>
-          <w:rFonts w:ascii="Arial" w:hAnsi="Arial" w:eastAsia="Times New Roman" w:cs="Arial"/>
-          <w:bCs/>
-          <w:sz w:val="20"/>
-          <w:szCs w:val="20"/>
-        </w:rPr>
-      </w:pPr>
-      <w:r>
-        <w:rPr>
-          <w:rFonts w:ascii="Arial" w:hAnsi="Arial" w:eastAsia="Times New Roman" w:cs="Arial"/>
-          <w:b/>
-          <w:sz w:val="20"/>
-          <w:szCs w:val="20"/>
-        </w:rPr>
-        <w:t>Regra 1:</w:t>
-      </w:r>
-      <w:r>
-        <w:rPr>
-          <w:rFonts w:ascii="Arial" w:hAnsi="Arial" w:eastAsia="Times New Roman" w:cs="Arial"/>
-          <w:bCs/>
-          <w:sz w:val="20"/>
-          <w:szCs w:val="20"/>
-        </w:rPr>
-        <w:t xml:space="preserve"> Preencha o espaço a seguir com TODOS os comandos para implementar a regra 1 da política de segurança proposta por sua equipe na atividade 6.</w:t>
-      </w:r>
-    </w:p>
-    <w:p>
-      <w:pPr>
-        <w:rPr>
-          <w:rFonts w:ascii="Arial" w:hAnsi="Arial" w:eastAsia="Times New Roman" w:cs="Arial"/>
-          <w:bCs/>
-          <w:sz w:val="20"/>
-          <w:szCs w:val="20"/>
-        </w:rPr>
-      </w:pPr>
-      <w:r>
-        <w:rPr>
-          <w:rFonts w:ascii="Arial" w:hAnsi="Arial" w:eastAsia="Times New Roman" w:cs="Arial"/>
-          <w:bCs/>
-          <w:color w:val="C00000"/>
-          <w:sz w:val="20"/>
-          <w:szCs w:val="20"/>
-          <w:highlight w:val="yellow"/>
-        </w:rPr>
-        <w:t>&lt;preencha aqui&gt;</w:t>
-      </w:r>
-    </w:p>
-    <w:p>
-      <w:pPr>
-        <w:rPr>
-          <w:rFonts w:ascii="Arial" w:hAnsi="Arial" w:eastAsia="Times New Roman" w:cs="Arial"/>
-          <w:bCs/>
-          <w:sz w:val="20"/>
-          <w:szCs w:val="20"/>
-        </w:rPr>
-      </w:pPr>
-    </w:p>
-    <w:p>
-      <w:pPr>
-        <w:rPr>
-          <w:rFonts w:ascii="Arial" w:hAnsi="Arial" w:eastAsia="Times New Roman" w:cs="Arial"/>
-          <w:bCs/>
-          <w:sz w:val="20"/>
-          <w:szCs w:val="20"/>
-        </w:rPr>
-      </w:pPr>
-    </w:p>
-    <w:p>
-      <w:pPr>
-        <w:rPr>
-          <w:rFonts w:ascii="Arial" w:hAnsi="Arial" w:eastAsia="Times New Roman" w:cs="Arial"/>
-          <w:bCs/>
-          <w:sz w:val="20"/>
-          <w:szCs w:val="20"/>
-        </w:rPr>
-      </w:pPr>
-    </w:p>
-    <w:p>
-      <w:pPr>
-        <w:rPr>
-          <w:rFonts w:ascii="Arial" w:hAnsi="Arial" w:eastAsia="Times New Roman" w:cs="Arial"/>
-          <w:bCs/>
-          <w:sz w:val="20"/>
-          <w:szCs w:val="20"/>
-        </w:rPr>
-      </w:pPr>
-    </w:p>
-    <w:p>
-      <w:pPr>
-        <w:rPr>
-          <w:rFonts w:ascii="Arial" w:hAnsi="Arial" w:eastAsia="Times New Roman" w:cs="Arial"/>
-          <w:bCs/>
-          <w:sz w:val="20"/>
-          <w:szCs w:val="20"/>
-        </w:rPr>
-      </w:pPr>
-    </w:p>
-    <w:p>
-      <w:pPr>
-        <w:rPr>
-          <w:rFonts w:ascii="Arial" w:hAnsi="Arial" w:eastAsia="Times New Roman" w:cs="Arial"/>
-          <w:bCs/>
-          <w:sz w:val="20"/>
-          <w:szCs w:val="20"/>
-        </w:rPr>
-      </w:pPr>
-    </w:p>
-    <w:p>
-      <w:pPr>
-        <w:rPr>
-          <w:rFonts w:ascii="Arial" w:hAnsi="Arial" w:eastAsia="Times New Roman" w:cs="Arial"/>
-          <w:bCs/>
-          <w:sz w:val="20"/>
-          <w:szCs w:val="20"/>
-        </w:rPr>
-      </w:pPr>
-      <w:r>
-        <w:rPr>
-          <w:rFonts w:ascii="Arial" w:hAnsi="Arial" w:eastAsia="Times New Roman" w:cs="Arial"/>
-          <w:b/>
-          <w:sz w:val="20"/>
-          <w:szCs w:val="20"/>
-        </w:rPr>
-        <w:t>Regra 2:</w:t>
-      </w:r>
-      <w:r>
-        <w:rPr>
-          <w:rFonts w:ascii="Arial" w:hAnsi="Arial" w:eastAsia="Times New Roman" w:cs="Arial"/>
-          <w:bCs/>
-          <w:sz w:val="20"/>
-          <w:szCs w:val="20"/>
-        </w:rPr>
-        <w:t xml:space="preserve"> Preencha o espaço a seguir com TODOS os comandos para implementar a regra 2 da política de segurança proposta por sua equipe na atividade 6.</w:t>
-      </w:r>
-    </w:p>
-    <w:p>
-      <w:pPr>
-        <w:rPr>
-          <w:rFonts w:ascii="Arial" w:hAnsi="Arial" w:eastAsia="Times New Roman" w:cs="Arial"/>
-          <w:b/>
-          <w:sz w:val="20"/>
-          <w:szCs w:val="20"/>
-        </w:rPr>
-      </w:pPr>
-      <w:r>
-        <w:rPr>
-          <w:rFonts w:ascii="Arial" w:hAnsi="Arial" w:eastAsia="Times New Roman" w:cs="Arial"/>
-          <w:bCs/>
-          <w:color w:val="C00000"/>
-          <w:sz w:val="20"/>
-          <w:szCs w:val="20"/>
-          <w:highlight w:val="yellow"/>
-        </w:rPr>
-        <w:t>&lt;preencha aqui&gt;</w:t>
-      </w:r>
-    </w:p>
-    <w:p>
-      <w:pPr>
-        <w:rPr>
-          <w:rFonts w:ascii="Arial" w:hAnsi="Arial" w:eastAsia="Times New Roman" w:cs="Arial"/>
-          <w:b/>
-          <w:sz w:val="20"/>
-          <w:szCs w:val="20"/>
-        </w:rPr>
-      </w:pPr>
-    </w:p>
-    <w:p>
-      <w:pPr>
-        <w:rPr>
-          <w:rFonts w:ascii="Arial" w:hAnsi="Arial" w:eastAsia="Times New Roman" w:cs="Arial"/>
-          <w:b/>
-          <w:sz w:val="20"/>
-          <w:szCs w:val="20"/>
-        </w:rPr>
-      </w:pPr>
-    </w:p>
-    <w:p>
-      <w:pPr>
-        <w:rPr>
-          <w:rFonts w:ascii="Arial" w:hAnsi="Arial" w:eastAsia="Times New Roman" w:cs="Arial"/>
-          <w:b/>
-          <w:sz w:val="20"/>
-          <w:szCs w:val="20"/>
-        </w:rPr>
-      </w:pPr>
-    </w:p>
-    <w:p>
-      <w:pPr>
-        <w:rPr>
-          <w:rFonts w:ascii="Arial" w:hAnsi="Arial" w:eastAsia="Times New Roman" w:cs="Arial"/>
-          <w:b/>
-          <w:sz w:val="20"/>
-          <w:szCs w:val="20"/>
-        </w:rPr>
-      </w:pPr>
-    </w:p>
-    <w:p>
-      <w:pPr>
-        <w:rPr>
-          <w:rFonts w:ascii="Arial" w:hAnsi="Arial" w:eastAsia="Times New Roman" w:cs="Arial"/>
-          <w:bCs/>
-          <w:sz w:val="20"/>
-          <w:szCs w:val="20"/>
-        </w:rPr>
-      </w:pPr>
-      <w:r>
-        <w:rPr>
-          <w:rFonts w:ascii="Arial" w:hAnsi="Arial" w:eastAsia="Times New Roman" w:cs="Arial"/>
-          <w:b/>
-          <w:sz w:val="20"/>
-          <w:szCs w:val="20"/>
-        </w:rPr>
-        <w:t>Regra 3:</w:t>
-      </w:r>
-      <w:r>
-        <w:rPr>
-          <w:rFonts w:ascii="Arial" w:hAnsi="Arial" w:eastAsia="Times New Roman" w:cs="Arial"/>
-          <w:bCs/>
-          <w:sz w:val="20"/>
-          <w:szCs w:val="20"/>
-        </w:rPr>
-        <w:t xml:space="preserve"> Preencha o espaço a seguir com TODOS os comandos para implementar a regra 3 da política de segurança proposta por sua equipe na atividade 6.</w:t>
-      </w:r>
-    </w:p>
-    <w:p>
-      <w:pPr>
-        <w:rPr>
-          <w:rFonts w:ascii="Arial" w:hAnsi="Arial" w:eastAsia="Times New Roman" w:cs="Arial"/>
-          <w:b/>
-          <w:sz w:val="20"/>
-          <w:szCs w:val="20"/>
-        </w:rPr>
-      </w:pPr>
-      <w:r>
-        <w:rPr>
-          <w:rFonts w:ascii="Arial" w:hAnsi="Arial" w:eastAsia="Times New Roman" w:cs="Arial"/>
-          <w:bCs/>
-          <w:color w:val="C00000"/>
-          <w:sz w:val="20"/>
-          <w:szCs w:val="20"/>
-          <w:highlight w:val="yellow"/>
-        </w:rPr>
-        <w:t>&lt;preencha aqui&gt;</w:t>
-      </w:r>
-    </w:p>
-    <w:p>
-      <w:pPr>
-        <w:rPr>
-          <w:rFonts w:ascii="Arial" w:hAnsi="Arial" w:eastAsia="Times New Roman" w:cs="Arial"/>
-          <w:b/>
-          <w:sz w:val="20"/>
-          <w:szCs w:val="20"/>
-        </w:rPr>
-      </w:pPr>
-    </w:p>
-    <w:p>
-      <w:pPr>
-        <w:rPr>
-          <w:rFonts w:ascii="Arial" w:hAnsi="Arial" w:eastAsia="Times New Roman" w:cs="Arial"/>
-          <w:b/>
-          <w:sz w:val="20"/>
-          <w:szCs w:val="20"/>
-        </w:rPr>
-      </w:pPr>
-    </w:p>
-    <w:p>
-      <w:pPr>
-        <w:rPr>
-          <w:rFonts w:ascii="Arial" w:hAnsi="Arial" w:eastAsia="Times New Roman" w:cs="Arial"/>
-          <w:b/>
-          <w:sz w:val="20"/>
-          <w:szCs w:val="20"/>
-        </w:rPr>
-      </w:pPr>
-    </w:p>
-    <w:p>
-      <w:pPr>
-        <w:rPr>
-          <w:rFonts w:ascii="Arial" w:hAnsi="Arial" w:eastAsia="Times New Roman" w:cs="Arial"/>
-          <w:b/>
-          <w:sz w:val="20"/>
-          <w:szCs w:val="20"/>
-        </w:rPr>
-      </w:pPr>
-    </w:p>
-    <w:p>
-      <w:pPr>
-        <w:rPr>
-          <w:rFonts w:ascii="Arial" w:hAnsi="Arial" w:eastAsia="Times New Roman" w:cs="Arial"/>
-          <w:b/>
-          <w:sz w:val="20"/>
-          <w:szCs w:val="20"/>
-        </w:rPr>
-      </w:pPr>
-    </w:p>
-    <w:p>
-      <w:pPr>
-        <w:rPr>
-          <w:rFonts w:ascii="Arial" w:hAnsi="Arial" w:eastAsia="Times New Roman" w:cs="Arial"/>
-          <w:b/>
-          <w:sz w:val="20"/>
-          <w:szCs w:val="20"/>
-        </w:rPr>
-      </w:pPr>
-    </w:p>
-    <w:p>
-      <w:pPr>
-        <w:rPr>
-          <w:rFonts w:ascii="Arial" w:hAnsi="Arial" w:eastAsia="Times New Roman" w:cs="Arial"/>
-          <w:bCs/>
-          <w:sz w:val="20"/>
-          <w:szCs w:val="20"/>
-        </w:rPr>
-      </w:pPr>
-      <w:r>
-        <w:rPr>
-          <w:rFonts w:ascii="Arial" w:hAnsi="Arial" w:eastAsia="Times New Roman" w:cs="Arial"/>
-          <w:b/>
-          <w:sz w:val="20"/>
-          <w:szCs w:val="20"/>
-        </w:rPr>
-        <w:t xml:space="preserve">Atividade 8 (1 ponto). </w:t>
-      </w:r>
-      <w:r>
-        <w:rPr>
-          <w:rFonts w:ascii="Arial" w:hAnsi="Arial" w:eastAsia="Times New Roman" w:cs="Arial"/>
-          <w:bCs/>
-          <w:sz w:val="20"/>
-          <w:szCs w:val="20"/>
-        </w:rPr>
-        <w:t>Apresente os comandos necessários para configurar roteamento RIP no roteador existente.</w:t>
-      </w:r>
-    </w:p>
-    <w:p>
-      <w:pPr>
-        <w:rPr>
-          <w:rFonts w:ascii="Arial" w:hAnsi="Arial" w:eastAsia="Times New Roman" w:cs="Arial"/>
-          <w:b/>
-          <w:sz w:val="20"/>
-          <w:szCs w:val="20"/>
-        </w:rPr>
-      </w:pPr>
-      <w:r>
-        <w:rPr>
-          <w:rFonts w:ascii="Arial" w:hAnsi="Arial" w:eastAsia="Times New Roman" w:cs="Arial"/>
-          <w:bCs/>
-          <w:color w:val="C00000"/>
-          <w:sz w:val="20"/>
-          <w:szCs w:val="20"/>
-          <w:highlight w:val="yellow"/>
-        </w:rPr>
-        <w:t>&lt;preencha aqui&gt;</w:t>
-      </w:r>
-    </w:p>
-    <w:p>
-      <w:pPr>
-        <w:rPr>
-          <w:rFonts w:ascii="Arial" w:hAnsi="Arial" w:eastAsia="Times New Roman" w:cs="Arial"/>
-          <w:b/>
-          <w:sz w:val="20"/>
-          <w:szCs w:val="20"/>
-        </w:rPr>
-      </w:pPr>
-    </w:p>
-    <w:p>
-      <w:pPr>
-        <w:rPr>
-          <w:rFonts w:ascii="Arial" w:hAnsi="Arial" w:eastAsia="Times New Roman" w:cs="Arial"/>
-          <w:b/>
-          <w:sz w:val="20"/>
-          <w:szCs w:val="20"/>
-        </w:rPr>
-      </w:pPr>
-    </w:p>
-    <w:p>
-      <w:pPr>
-        <w:rPr>
-          <w:rFonts w:ascii="Arial" w:hAnsi="Arial" w:eastAsia="Times New Roman" w:cs="Arial"/>
-          <w:b/>
-          <w:sz w:val="20"/>
-          <w:szCs w:val="20"/>
-        </w:rPr>
-      </w:pPr>
     </w:p>
     <w:p>
       <w:pPr>
@@ -13611,7 +13529,7 @@
     <w:lsdException w:uiPriority="99" w:name="HTML Sample"/>
     <w:lsdException w:uiPriority="99" w:name="HTML Typewriter"/>
     <w:lsdException w:uiPriority="99" w:name="HTML Variable"/>
-    <w:lsdException w:uiPriority="99" w:name="Normal Table"/>
+    <w:lsdException w:qFormat="1" w:uiPriority="99" w:name="Normal Table"/>
     <w:lsdException w:uiPriority="99" w:name="annotation subject"/>
     <w:lsdException w:uiPriority="99" w:name="Table Simple 1"/>
     <w:lsdException w:uiPriority="99" w:name="Table Simple 2"/>
@@ -13958,6 +13876,7 @@
     <w:name w:val="Normal Table"/>
     <w:semiHidden/>
     <w:unhideWhenUsed/>
+    <w:qFormat/>
     <w:uiPriority w:val="99"/>
     <w:tblPr>
       <w:tblCellMar>

</xml_diff>